<commit_message>
Enhance .gitignore, improve summary extraction logic, and update README with GUI instructions and build steps for macOS and Windows
</commit_message>
<xml_diff>
--- a/collected_summaries.docx
+++ b/collected_summaries.docx
@@ -203,17 +203,29 @@
       <w:bookmarkEnd w:id="2"/>
       <w:bookmarkEnd w:id="3"/>
     </w:p>
-    <w:bookmarkStart w:id="2" w:name="document-3"/>
-    <w:bookmarkStart w:id="3" w:name="summary"/>
     <w:p>
       <w:pPr>
         <w:pStyle w:val="Heading2"/>
       </w:pPr>
+      <w:bookmarkStart w:id="2" w:name="summary"/>
+      <w:r>
+        <w:t>Summary</w:t>
+      </w:r>
+      <w:r>
+        <w:t xml:space="preserve"> (document3.docx)</w:t>
+      </w:r>
+    </w:p>
+    <w:bookmarkStart w:id="3" w:name="document-4"/>
+    <w:bookmarkStart w:id="4" w:name="summary"/>
+    <w:p>
+      <w:pPr>
+        <w:pStyle w:val="Heading2"/>
+      </w:pPr>
       <w:r>
         <w:t xml:space="preserve">Summary</w:t>
       </w:r>
       <w:r>
-        <w:t xml:space="preserve"> (document3.docx)</w:t>
+        <w:t xml:space="preserve"> (document4.docx)</w:t>
       </w:r>
     </w:p>
     <w:p>
@@ -221,39 +233,16 @@
         <w:pStyle w:val="FirstParagraph"/>
       </w:pPr>
       <w:r>
-        <w:t xml:space="preserve">Duis aute irure dolor in reprehenderit in voluptate velit esse cillum dolore eu fugiat nulla pariatur.</w:t>
+        <w:t xml:space="preserve">Excepteur sint occaecat cupidatat non proident, sunt in culpa qui officia deserunt mollit anim id est laborum.</w:t>
       </w:r>
     </w:p>
     <w:bookmarkEnd w:id="4"/>
     <w:bookmarkEnd w:id="5"/>
-    <w:bookmarkStart w:id="4" w:name="document-4"/>
-    <w:bookmarkStart w:id="5" w:name="summary"/>
     <w:p>
       <w:pPr>
         <w:pStyle w:val="Heading2"/>
       </w:pPr>
-      <w:r>
-        <w:t xml:space="preserve">Summary</w:t>
-      </w:r>
-      <w:r>
-        <w:t xml:space="preserve"> (document4.docx)</w:t>
-      </w:r>
-    </w:p>
-    <w:p>
-      <w:pPr>
-        <w:pStyle w:val="FirstParagraph"/>
-      </w:pPr>
-      <w:r>
-        <w:t xml:space="preserve">Excepteur sint occaecat cupidatat non proident, sunt in culpa qui officia deserunt mollit anim id est laborum.</w:t>
-      </w:r>
-    </w:p>
-    <w:bookmarkEnd w:id="6"/>
-    <w:bookmarkEnd w:id="7"/>
-    <w:p>
-      <w:pPr>
-        <w:pStyle w:val="Heading2"/>
-      </w:pPr>
-      <w:bookmarkStart w:id="6" w:name="summary"/>
+      <w:bookmarkStart w:id="5" w:name="summary"/>
       <w:r>
         <w:t>Summary</w:t>
       </w:r>
@@ -352,15 +341,38 @@
         <w:t>.</w:t>
       </w:r>
     </w:p>
+    <w:bookmarkEnd w:id="6"/>
+    <w:bookmarkEnd w:id="7"/>
+    <w:p>
+      <w:pPr>
+        <w:pStyle w:val="BodyText"/>
+      </w:pPr>
+    </w:p>
+    <w:bookmarkStart w:id="6" w:name="document-6"/>
+    <w:bookmarkStart w:id="7" w:name="summary"/>
+    <w:p>
+      <w:pPr>
+        <w:pStyle w:val="Heading2"/>
+      </w:pPr>
+      <w:r>
+        <w:t xml:space="preserve">Summary</w:t>
+      </w:r>
+      <w:r>
+        <w:t xml:space="preserve"> (document6.docx)</w:t>
+      </w:r>
+    </w:p>
+    <w:p>
+      <w:pPr>
+        <w:pStyle w:val="FirstParagraph"/>
+      </w:pPr>
+      <w:r>
+        <w:t xml:space="preserve">Nemo enim ipsam voluptatem quia voluptas sit aspernatur aut odit aut fugit.</w:t>
+      </w:r>
+    </w:p>
     <w:bookmarkEnd w:id="8"/>
     <w:bookmarkEnd w:id="9"/>
-    <w:p>
-      <w:pPr>
-        <w:pStyle w:val="BodyText"/>
-      </w:pPr>
-    </w:p>
-    <w:bookmarkStart w:id="7" w:name="document-6"/>
-    <w:bookmarkStart w:id="8" w:name="summary"/>
+    <w:bookmarkStart w:id="8" w:name="document-7"/>
+    <w:bookmarkStart w:id="9" w:name="summary"/>
     <w:p>
       <w:pPr>
         <w:pStyle w:val="Heading2"/>
@@ -369,7 +381,7 @@
         <w:t xml:space="preserve">Summary</w:t>
       </w:r>
       <w:r>
-        <w:t xml:space="preserve"> (document6.docx)</w:t>
+        <w:t xml:space="preserve"> (document7.docx)</w:t>
       </w:r>
     </w:p>
     <w:p>
@@ -377,39 +389,16 @@
         <w:pStyle w:val="FirstParagraph"/>
       </w:pPr>
       <w:r>
-        <w:t xml:space="preserve">Nemo enim ipsam voluptatem quia voluptas sit aspernatur aut odit aut fugit.</w:t>
+        <w:t xml:space="preserve">Neque porro quisquam est, qui dolorem ipsum quia dolor sit amet, consectetur, adipisci velit.</w:t>
       </w:r>
     </w:p>
     <w:bookmarkEnd w:id="10"/>
     <w:bookmarkEnd w:id="11"/>
-    <w:bookmarkStart w:id="9" w:name="document-7"/>
-    <w:bookmarkStart w:id="10" w:name="summary"/>
     <w:p>
       <w:pPr>
         <w:pStyle w:val="Heading2"/>
       </w:pPr>
-      <w:r>
-        <w:t xml:space="preserve">Summary</w:t>
-      </w:r>
-      <w:r>
-        <w:t xml:space="preserve"> (document7.docx)</w:t>
-      </w:r>
-    </w:p>
-    <w:p>
-      <w:pPr>
-        <w:pStyle w:val="FirstParagraph"/>
-      </w:pPr>
-      <w:r>
-        <w:t xml:space="preserve">Neque porro quisquam est, qui dolorem ipsum quia dolor sit amet, consectetur, adipisci velit.</w:t>
-      </w:r>
-    </w:p>
-    <w:bookmarkEnd w:id="12"/>
-    <w:bookmarkEnd w:id="13"/>
-    <w:p>
-      <w:pPr>
-        <w:pStyle w:val="Heading2"/>
-      </w:pPr>
-      <w:bookmarkStart w:id="11" w:name="summary"/>
+      <w:bookmarkStart w:id="10" w:name="summary"/>
       <w:r>
         <w:t>Summary</w:t>
       </w:r>
@@ -507,11 +496,11 @@
           </wp:inline>
         </w:drawing>
       </w:r>
-      <w:bookmarkEnd w:id="14"/>
-      <w:bookmarkEnd w:id="15"/>
-    </w:p>
-    <w:bookmarkStart w:id="12" w:name="document-9"/>
-    <w:bookmarkStart w:id="13" w:name="summary"/>
+      <w:bookmarkEnd w:id="12"/>
+      <w:bookmarkEnd w:id="13"/>
+    </w:p>
+    <w:bookmarkStart w:id="11" w:name="document-9"/>
+    <w:bookmarkStart w:id="12" w:name="summary"/>
     <w:p>
       <w:pPr>
         <w:pStyle w:val="Heading2"/>
@@ -529,21 +518,94 @@
       </w:pPr>
       <w:r>
         <w:t xml:space="preserve">Temporibus autem quibusdam et aut officiis debitis aut rerum necessitatibus saepe eveniet.</w:t>
+      </w:r>
+    </w:p>
+    <w:bookmarkEnd w:id="14"/>
+    <w:bookmarkEnd w:id="15"/>
+    <w:bookmarkStart w:id="13" w:name="document-10"/>
+    <w:bookmarkStart w:id="14" w:name="summary"/>
+    <w:p>
+      <w:pPr>
+        <w:pStyle w:val="Heading2"/>
+      </w:pPr>
+      <w:r>
+        <w:t xml:space="preserve">Summary</w:t>
+      </w:r>
+      <w:r>
+        <w:t xml:space="preserve"> (document10.docx)</w:t>
+      </w:r>
+    </w:p>
+    <w:p>
+      <w:pPr>
+        <w:pStyle w:val="FirstParagraph"/>
+      </w:pPr>
+      <w:r>
+        <w:t xml:space="preserve">At vero eos et accusamus et iusto odio dignissimos ducimus qui blanditiis praesentium.</w:t>
       </w:r>
     </w:p>
     <w:bookmarkEnd w:id="16"/>
     <w:bookmarkEnd w:id="17"/>
-    <w:bookmarkStart w:id="14" w:name="document-10"/>
-    <w:bookmarkStart w:id="15" w:name="summary"/>
     <w:p>
       <w:pPr>
         <w:pStyle w:val="Heading2"/>
       </w:pPr>
-      <w:r>
-        <w:t xml:space="preserve">Summary</w:t>
-      </w:r>
-      <w:r>
-        <w:t xml:space="preserve"> (document10.docx)</w:t>
+      <w:bookmarkStart w:id="15" w:name="summary"/>
+      <w:r>
+        <w:t>Summary</w:t>
+      </w:r>
+      <w:r>
+        <w:t xml:space="preserve"> (document11.docx)</w:t>
+      </w:r>
+    </w:p>
+    <w:p>
+      <w:pPr>
+        <w:pStyle w:val="BodyText"/>
+      </w:pPr>
+      <w:r>
+        <w:rPr>
+          <w:noProof/>
+        </w:rPr>
+        <w:drawing>
+          <wp:inline distT="0" distB="0" distL="0" distR="0" wp14:anchorId="5E3CD76D" wp14:editId="10E7EF9A">
+            <wp:extent cx="1740741" cy="3784600"/>
+            <wp:effectExtent l="0" t="0" r="0" b="0"/>
+            <wp:docPr id="4" name="Picture 1" descr="A screenshot of a phone&#10;&#10;AI-generated content may be incorrect."/>
+            <wp:cNvGraphicFramePr>
+              <a:graphicFrameLocks xmlns:a="http://schemas.openxmlformats.org/drawingml/2006/main" noChangeAspect="1"/>
+            </wp:cNvGraphicFramePr>
+            <a:graphic xmlns:a="http://schemas.openxmlformats.org/drawingml/2006/main">
+              <a:graphicData uri="http://schemas.openxmlformats.org/drawingml/2006/picture">
+                <pic:pic xmlns:pic="http://schemas.openxmlformats.org/drawingml/2006/picture">
+                  <pic:nvPicPr>
+                    <pic:cNvPr id="4" name="Picture 1" descr="A screenshot of a phone&#10;&#10;AI-generated content may be incorrect."/>
+                    <pic:cNvPicPr/>
+                  </pic:nvPicPr>
+                  <pic:blipFill>
+                    <a:blip r:embed="rId10" cstate="print">
+                      <a:extLst>
+                        <a:ext uri="{28A0092B-C50C-407E-A947-70E740481C1C}">
+                          <a14:useLocalDpi xmlns:a14="http://schemas.microsoft.com/office/drawing/2010/main" val="0"/>
+                        </a:ext>
+                      </a:extLst>
+                    </a:blip>
+                    <a:stretch>
+                      <a:fillRect/>
+                    </a:stretch>
+                  </pic:blipFill>
+                  <pic:spPr>
+                    <a:xfrm>
+                      <a:off x="0" y="0"/>
+                      <a:ext cx="1746113" cy="3796279"/>
+                    </a:xfrm>
+                    <a:prstGeom prst="rect">
+                      <a:avLst/>
+                    </a:prstGeom>
+                  </pic:spPr>
+                </pic:pic>
+              </a:graphicData>
+            </a:graphic>
+          </wp:inline>
+        </w:drawing>
       </w:r>
     </w:p>
     <w:p>
@@ -551,11 +613,184 @@
         <w:pStyle w:val="FirstParagraph"/>
       </w:pPr>
       <w:r>
-        <w:t xml:space="preserve">At vero eos et accusamus et iusto odio dignissimos ducimus qui blanditiis praesentium.</w:t>
-      </w:r>
-    </w:p>
-    <w:bookmarkEnd w:id="18"/>
-    <w:bookmarkEnd w:id="19"/>
+        <w:t>Asdhjhasdjasdajadasdsd</w:t>
+      </w:r>
+      <w:r>
+        <w:br/>
+        <w:t>ASD</w:t>
+      </w:r>
+      <w:r>
+        <w:br/>
+      </w:r>
+      <w:r>
+        <w:br/>
+      </w:r>
+    </w:p>
+    <w:tbl>
+      <w:tblPr>
+        <w:tblStyle w:val="TableGrid"/>
+        <w:tblW w:w="0" w:type="auto"/>
+        <w:tblLook w:val="04A0" w:firstRow="1" w:lastRow="0" w:firstColumn="1" w:lastColumn="0" w:noHBand="0" w:noVBand="1"/>
+      </w:tblPr>
+      <w:tblGrid>
+        <w:gridCol w:w="3121"/>
+        <w:gridCol w:w="3106"/>
+        <w:gridCol w:w="3123"/>
+      </w:tblGrid>
+      <w:tr>
+        <w:tc>
+          <w:tcPr>
+            <w:tcW w:w="3192" w:type="dxa"/>
+          </w:tcPr>
+          <w:p>
+            <w:pPr>
+              <w:pStyle w:val="FirstParagraph"/>
+            </w:pPr>
+            <w:r>
+              <w:t>asdasfa</w:t>
+            </w:r>
+          </w:p>
+        </w:tc>
+        <w:tc>
+          <w:tcPr>
+            <w:tcW w:w="3192" w:type="dxa"/>
+          </w:tcPr>
+          <w:p>
+            <w:pPr>
+              <w:pStyle w:val="FirstParagraph"/>
+            </w:pPr>
+            <w:r>
+              <w:t>asd</w:t>
+            </w:r>
+          </w:p>
+        </w:tc>
+        <w:tc>
+          <w:tcPr>
+            <w:tcW w:w="3192" w:type="dxa"/>
+          </w:tcPr>
+          <w:p>
+            <w:pPr>
+              <w:pStyle w:val="FirstParagraph"/>
+            </w:pPr>
+            <w:r>
+              <w:t>asdsasd</w:t>
+            </w:r>
+          </w:p>
+        </w:tc>
+      </w:tr>
+      <w:tr>
+        <w:tc>
+          <w:tcPr>
+            <w:tcW w:w="3192" w:type="dxa"/>
+          </w:tcPr>
+          <w:p>
+            <w:pPr>
+              <w:pStyle w:val="FirstParagraph"/>
+            </w:pPr>
+            <w:r>
+              <w:t>asd</w:t>
+            </w:r>
+          </w:p>
+        </w:tc>
+        <w:tc>
+          <w:tcPr>
+            <w:tcW w:w="3192" w:type="dxa"/>
+          </w:tcPr>
+          <w:p>
+            <w:pPr>
+              <w:pStyle w:val="FirstParagraph"/>
+            </w:pPr>
+          </w:p>
+        </w:tc>
+        <w:tc>
+          <w:tcPr>
+            <w:tcW w:w="3192" w:type="dxa"/>
+          </w:tcPr>
+          <w:p>
+            <w:pPr>
+              <w:pStyle w:val="FirstParagraph"/>
+            </w:pPr>
+          </w:p>
+        </w:tc>
+      </w:tr>
+      <w:tr>
+        <w:tc>
+          <w:tcPr>
+            <w:tcW w:w="3192" w:type="dxa"/>
+          </w:tcPr>
+          <w:p>
+            <w:pPr>
+              <w:pStyle w:val="FirstParagraph"/>
+            </w:pPr>
+            <w:r>
+              <w:t>sfaf</w:t>
+            </w:r>
+          </w:p>
+        </w:tc>
+        <w:tc>
+          <w:tcPr>
+            <w:tcW w:w="3192" w:type="dxa"/>
+          </w:tcPr>
+          <w:p>
+            <w:pPr>
+              <w:pStyle w:val="FirstParagraph"/>
+            </w:pPr>
+          </w:p>
+        </w:tc>
+        <w:tc>
+          <w:tcPr>
+            <w:tcW w:w="3192" w:type="dxa"/>
+          </w:tcPr>
+          <w:p>
+            <w:pPr>
+              <w:pStyle w:val="FirstParagraph"/>
+            </w:pPr>
+          </w:p>
+        </w:tc>
+      </w:tr>
+      <w:tr>
+        <w:tc>
+          <w:tcPr>
+            <w:tcW w:w="3192" w:type="dxa"/>
+          </w:tcPr>
+          <w:p>
+            <w:pPr>
+              <w:pStyle w:val="FirstParagraph"/>
+            </w:pPr>
+            <w:r>
+              <w:t>afs</w:t>
+            </w:r>
+          </w:p>
+        </w:tc>
+        <w:tc>
+          <w:tcPr>
+            <w:tcW w:w="3192" w:type="dxa"/>
+          </w:tcPr>
+          <w:p>
+            <w:pPr>
+              <w:pStyle w:val="FirstParagraph"/>
+            </w:pPr>
+          </w:p>
+        </w:tc>
+        <w:tc>
+          <w:tcPr>
+            <w:tcW w:w="3192" w:type="dxa"/>
+          </w:tcPr>
+          <w:p>
+            <w:pPr>
+              <w:pStyle w:val="FirstParagraph"/>
+            </w:pPr>
+          </w:p>
+        </w:tc>
+      </w:tr>
+      <w:bookmarkEnd w:id="18"/>
+      <w:bookmarkEnd w:id="19"/>
+    </w:tbl>
+    <w:p>
+      <w:pPr>
+        <w:pStyle w:val="FirstParagraph"/>
+      </w:pPr>
+    </w:p>
     <w:sectPr>
       <w:footnotePr>
         <w:numRestart w:val="eachSect"/>
@@ -1866,6 +2101,24 @@
       <w:rFonts w:ascii="Consolas" w:hAnsi="Consolas"/>
       <w:sz w:val="22"/>
     </w:rPr>
+  </w:style>
+  <w:style w:type="table" w:styleId="TableGrid">
+    <w:name w:val="Table Grid"/>
+    <w:basedOn w:val="TableNormal"/>
+    <w:rsid w:val="002451CE"/>
+    <w:pPr>
+      <w:spacing w:after="0"/>
+    </w:pPr>
+    <w:tblPr>
+      <w:tblBorders>
+        <w:top w:val="single" w:sz="4" w:space="0" w:color="auto"/>
+        <w:left w:val="single" w:sz="4" w:space="0" w:color="auto"/>
+        <w:bottom w:val="single" w:sz="4" w:space="0" w:color="auto"/>
+        <w:right w:val="single" w:sz="4" w:space="0" w:color="auto"/>
+        <w:insideH w:val="single" w:sz="4" w:space="0" w:color="auto"/>
+        <w:insideV w:val="single" w:sz="4" w:space="0" w:color="auto"/>
+      </w:tblBorders>
+    </w:tblPr>
   </w:style>
 </w:styles>
 </file>

</xml_diff>